<commit_message>
"fixed package-lock conflict, added partial button functionality"
</commit_message>
<xml_diff>
--- a/public/swe-resume-template.docx
+++ b/public/swe-resume-template.docx
@@ -368,7 +368,7 @@
           </mc:Choice>
           <mc:Fallback>
             <w:pict>
-              <v:shape w14:anchorId="12EB2960" id="Graphic 5" o:spid="_x0000_s1026" style="position:absolute;margin-left:36pt;margin-top:15.7pt;width:540pt;height:.1pt;z-index:15729152;visibility:visible;mso-wrap-style:square;mso-wrap-distance-left:0;mso-wrap-distance-top:0;mso-wrap-distance-right:0;mso-wrap-distance-bottom:0;mso-position-horizontal:absolute;mso-position-horizontal-relative:page;mso-position-vertical:absolute;mso-position-vertical-relative:text;v-text-anchor:top" coordsize="6858000,1270" o:gfxdata="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" path="m,l6858000,e" filled="f" strokeweight=".14039mm">
+              <v:shape w14:anchorId="2EDD8AE4" id="Graphic 5" o:spid="_x0000_s1026" style="position:absolute;margin-left:36pt;margin-top:15.7pt;width:540pt;height:.1pt;z-index:15729152;visibility:visible;mso-wrap-style:square;mso-wrap-distance-left:0;mso-wrap-distance-top:0;mso-wrap-distance-right:0;mso-wrap-distance-bottom:0;mso-position-horizontal:absolute;mso-position-horizontal-relative:page;mso-position-vertical:absolute;mso-position-vertical-relative:text;v-text-anchor:top" coordsize="6858000,1270" o:gfxdata="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" path="m,l6858000,e" filled="f" strokeweight=".14039mm">
                 <v:path arrowok="t"/>
                 <w10:wrap anchorx="page"/>
               </v:shape>
@@ -397,14 +397,7 @@
           <w:rFonts w:ascii="Arial Black"/>
           <w:w w:val="80"/>
         </w:rPr>
-        <w:t>Unive</w:t>
-      </w:r>
-      <w:r>
-        <w:rPr>
-          <w:rFonts w:ascii="Arial Black"/>
-          <w:w w:val="80"/>
-        </w:rPr>
-        <w:t>rsity</w:t>
+        <w:t>University</w:t>
       </w:r>
       <w:r>
         <w:rPr>
@@ -419,6 +412,28 @@
           <w:spacing w:val="-4"/>
         </w:rPr>
         <w:t>Name</w:t>
+      </w:r>
+      <w:r>
+        <w:rPr>
+          <w:rFonts w:ascii="Arial Black"/>
+          <w:spacing w:val="-4"/>
+        </w:rPr>
+        <w:t xml:space="preserve"> </w:t>
+      </w:r>
+      <w:r>
+        <w:t>{</w:t>
+      </w:r>
+      <w:r>
+        <w:t>{</w:t>
+      </w:r>
+      <w:r>
+        <w:t>University</w:t>
+      </w:r>
+      <w:r>
+        <w:t>}</w:t>
+      </w:r>
+      <w:r>
+        <w:t>}</w:t>
       </w:r>
       <w:r>
         <w:rPr>
@@ -471,14 +486,23 @@
           <w:sz w:val="20"/>
         </w:rPr>
       </w:pPr>
-      <w:r>
-        <w:rPr>
-          <w:rFonts w:ascii="Calibri"/>
-          <w:i/>
-          <w:w w:val="105"/>
-          <w:sz w:val="20"/>
-        </w:rPr>
-        <w:t>Degree Name</w:t>
+      <w:proofErr w:type="gramStart"/>
+      <w:r>
+        <w:t>{</w:t>
+      </w:r>
+      <w:r>
+        <w:t>{</w:t>
+      </w:r>
+      <w:proofErr w:type="spellStart"/>
+      <w:r>
+        <w:t>DegreeName</w:t>
+      </w:r>
+      <w:proofErr w:type="spellEnd"/>
+      <w:r>
+        <w:t>}</w:t>
+      </w:r>
+      <w:r>
+        <w:t>}</w:t>
       </w:r>
       <w:r>
         <w:rPr>
@@ -497,7 +521,17 @@
           <w:w w:val="105"/>
           <w:sz w:val="20"/>
         </w:rPr>
-        <w:t>(GPA:</w:t>
+        <w:t>(</w:t>
+      </w:r>
+      <w:proofErr w:type="gramEnd"/>
+      <w:r>
+        <w:rPr>
+          <w:rFonts w:ascii="Calibri"/>
+          <w:i/>
+          <w:w w:val="105"/>
+          <w:sz w:val="20"/>
+        </w:rPr>
+        <w:t>GPA:</w:t>
       </w:r>
       <w:r>
         <w:rPr>
@@ -510,13 +544,19 @@
         <w:t xml:space="preserve"> </w:t>
       </w:r>
       <w:r>
-        <w:rPr>
-          <w:rFonts w:ascii="Calibri"/>
-          <w:i/>
-          <w:w w:val="105"/>
-          <w:sz w:val="20"/>
-        </w:rPr>
-        <w:t>X.XX</w:t>
+        <w:t>{</w:t>
+      </w:r>
+      <w:r>
+        <w:t>{</w:t>
+      </w:r>
+      <w:r>
+        <w:t>GPA</w:t>
+      </w:r>
+      <w:r>
+        <w:t>}</w:t>
+      </w:r>
+      <w:r>
+        <w:t>}</w:t>
       </w:r>
       <w:r>
         <w:rPr>
@@ -600,6 +640,7 @@
         </w:rPr>
         <w:t xml:space="preserve"> </w:t>
       </w:r>
+      <w:proofErr w:type="gramStart"/>
       <w:r>
         <w:rPr>
           <w:rFonts w:ascii="Arial Black" w:hAnsi="Arial Black"/>
@@ -609,11 +650,20 @@
         <w:t xml:space="preserve">Coursework: </w:t>
       </w:r>
       <w:r>
-        <w:rPr>
-          <w:spacing w:val="-8"/>
-          <w:sz w:val="20"/>
-        </w:rPr>
+        <w:t>{</w:t>
+      </w:r>
+      <w:r>
+        <w:t>{</w:t>
+      </w:r>
+      <w:proofErr w:type="gramEnd"/>
+      <w:r>
         <w:t>Classes</w:t>
+      </w:r>
+      <w:r>
+        <w:t>}</w:t>
+      </w:r>
+      <w:r>
+        <w:t>}</w:t>
       </w:r>
     </w:p>
     <w:p>
@@ -639,13 +689,10 @@
         </w:tabs>
       </w:pPr>
       <w:r>
-        <w:rPr>
-          <w:noProof/>
-        </w:rPr>
         <mc:AlternateContent>
           <mc:Choice Requires="wps">
             <w:drawing>
-              <wp:anchor distT="0" distB="0" distL="0" distR="0" simplePos="0" relativeHeight="15729664" behindDoc="0" locked="0" layoutInCell="1" allowOverlap="1" wp14:anchorId="2F8335B6" wp14:editId="2F8335B7">
+              <wp:anchor distT="0" distB="0" distL="0" distR="0" simplePos="0" relativeHeight="251657728" behindDoc="0" locked="0" layoutInCell="1" allowOverlap="1" wp14:anchorId="2F8335B6" wp14:editId="2F8335B7">
                 <wp:simplePos x="0" y="0"/>
                 <wp:positionH relativeFrom="page">
                   <wp:posOffset>457200</wp:posOffset>
@@ -709,7 +756,7 @@
           </mc:Choice>
           <mc:Fallback>
             <w:pict>
-              <v:shape w14:anchorId="0EDC2D2B" id="Graphic 6" o:spid="_x0000_s1026" style="position:absolute;margin-left:36pt;margin-top:1.85pt;width:540pt;height:.1pt;z-index:15729664;visibility:visible;mso-wrap-style:square;mso-wrap-distance-left:0;mso-wrap-distance-top:0;mso-wrap-distance-right:0;mso-wrap-distance-bottom:0;mso-position-horizontal:absolute;mso-position-horizontal-relative:page;mso-position-vertical:absolute;mso-position-vertical-relative:text;v-text-anchor:top" coordsize="6858000,1270" o:gfxdata="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" path="m,l6858000,e" filled="f" strokeweight=".14039mm">
+              <v:shape w14:anchorId="7163FD94" id="Graphic 6" o:spid="_x0000_s1026" style="position:absolute;margin-left:36pt;margin-top:1.85pt;width:540pt;height:.1pt;z-index:251657728;visibility:visible;mso-wrap-style:square;mso-wrap-distance-left:0;mso-wrap-distance-top:0;mso-wrap-distance-right:0;mso-wrap-distance-bottom:0;mso-position-horizontal:absolute;mso-position-horizontal-relative:page;mso-position-vertical:absolute;mso-position-vertical-relative:text;v-text-anchor:top" coordsize="6858000,1270" o:gfxdata="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" path="m,l6858000,e" filled="f" strokeweight=".14039mm">
                 <v:path arrowok="t"/>
                 <w10:wrap anchorx="page"/>
               </v:shape>
@@ -718,11 +765,35 @@
         </mc:AlternateContent>
       </w:r>
       <w:r>
+        <w:t>{</w:t>
+      </w:r>
+      <w:r>
+        <w:t>{Experience}</w:t>
+      </w:r>
+      <w:r>
+        <w:t>}</w:t>
+      </w:r>
+    </w:p>
+    <w:p>
+      <w:pPr>
+        <w:pStyle w:val="Heading2"/>
+        <w:tabs>
+          <w:tab w:val="left" w:pos="8533"/>
+        </w:tabs>
+      </w:pPr>
+      <w:r>
         <w:rPr>
           <w:rFonts w:ascii="Arial Black" w:hAnsi="Arial Black"/>
           <w:w w:val="80"/>
         </w:rPr>
-        <w:t>Company</w:t>
+        <w:t>C</w:t>
+      </w:r>
+      <w:r>
+        <w:rPr>
+          <w:rFonts w:ascii="Arial Black" w:hAnsi="Arial Black"/>
+          <w:w w:val="80"/>
+        </w:rPr>
+        <w:t>ompany</w:t>
       </w:r>
       <w:r>
         <w:rPr>
@@ -949,7 +1020,7 @@
           </mc:Choice>
           <mc:Fallback>
             <w:pict>
-              <v:shape w14:anchorId="4BD2E922" id="Graphic 7" o:spid="_x0000_s1026" style="position:absolute;margin-left:36pt;margin-top:25.5pt;width:540pt;height:.1pt;z-index:15730176;visibility:visible;mso-wrap-style:square;mso-wrap-distance-left:0;mso-wrap-distance-top:0;mso-wrap-distance-right:0;mso-wrap-distance-bottom:0;mso-position-horizontal:absolute;mso-position-horizontal-relative:page;mso-position-vertical:absolute;mso-position-vertical-relative:text;v-text-anchor:top" coordsize="6858000,1270" o:gfxdata="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" path="m,l6858000,e" filled="f" strokeweight=".14039mm">
+              <v:shape w14:anchorId="680DF2BD" id="Graphic 7" o:spid="_x0000_s1026" style="position:absolute;margin-left:36pt;margin-top:25.5pt;width:540pt;height:.1pt;z-index:15730176;visibility:visible;mso-wrap-style:square;mso-wrap-distance-left:0;mso-wrap-distance-top:0;mso-wrap-distance-right:0;mso-wrap-distance-bottom:0;mso-position-horizontal:absolute;mso-position-horizontal-relative:page;mso-position-vertical:absolute;mso-position-vertical-relative:text;v-text-anchor:top" coordsize="6858000,1270" o:gfxdata="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" path="m,l6858000,e" filled="f" strokeweight=".14039mm">
                 <v:path arrowok="t"/>
                 <w10:wrap anchorx="page"/>
               </v:shape>
@@ -964,6 +1035,27 @@
           <w:spacing w:val="-2"/>
         </w:rPr>
         <w:t>Projects</w:t>
+      </w:r>
+    </w:p>
+    <w:p>
+      <w:pPr>
+        <w:spacing w:before="127"/>
+        <w:ind w:left="215"/>
+      </w:pPr>
+      <w:r>
+        <w:t>{</w:t>
+      </w:r>
+      <w:r>
+        <w:t>{P</w:t>
+      </w:r>
+      <w:r>
+        <w:t>rojects</w:t>
+      </w:r>
+      <w:r>
+        <w:t>}</w:t>
+      </w:r>
+      <w:r>
+        <w:t>}</w:t>
       </w:r>
     </w:p>
     <w:p>
@@ -1137,7 +1229,7 @@
           </mc:Choice>
           <mc:Fallback>
             <w:pict>
-              <v:shape w14:anchorId="2DAD4F1B" id="Graphic 8" o:spid="_x0000_s1026" style="position:absolute;margin-left:36pt;margin-top:25.5pt;width:540pt;height:.1pt;z-index:15730688;visibility:visible;mso-wrap-style:square;mso-wrap-distance-left:0;mso-wrap-distance-top:0;mso-wrap-distance-right:0;mso-wrap-distance-bottom:0;mso-position-horizontal:absolute;mso-position-horizontal-relative:page;mso-position-vertical:absolute;mso-position-vertical-relative:text;v-text-anchor:top" coordsize="6858000,1270" o:gfxdata="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" path="m,l6858000,e" filled="f" strokeweight=".14039mm">
+              <v:shape w14:anchorId="20370E2B" id="Graphic 8" o:spid="_x0000_s1026" style="position:absolute;margin-left:36pt;margin-top:25.5pt;width:540pt;height:.1pt;z-index:15730688;visibility:visible;mso-wrap-style:square;mso-wrap-distance-left:0;mso-wrap-distance-top:0;mso-wrap-distance-right:0;mso-wrap-distance-bottom:0;mso-position-horizontal:absolute;mso-position-horizontal-relative:page;mso-position-vertical:absolute;mso-position-vertical-relative:text;v-text-anchor:top" coordsize="6858000,1270" o:gfxdata="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" path="m,l6858000,e" filled="f" strokeweight=".14039mm">
                 <v:path arrowok="t"/>
                 <w10:wrap anchorx="page"/>
               </v:shape>
@@ -1172,6 +1264,7 @@
         <w:spacing w:before="83" w:line="261" w:lineRule="exact"/>
         <w:ind w:left="215" w:firstLine="0"/>
       </w:pPr>
+      <w:proofErr w:type="gramStart"/>
       <w:r>
         <w:rPr>
           <w:rFonts w:ascii="Arial Black"/>
@@ -1184,6 +1277,28 @@
           <w:w w:val="90"/>
         </w:rPr>
         <w:t>:</w:t>
+      </w:r>
+      <w:r>
+        <w:rPr>
+          <w:w w:val="90"/>
+        </w:rPr>
+        <w:t xml:space="preserve"> </w:t>
+      </w:r>
+      <w:r>
+        <w:t>{</w:t>
+      </w:r>
+      <w:r>
+        <w:t>{</w:t>
+      </w:r>
+      <w:proofErr w:type="gramEnd"/>
+      <w:r>
+        <w:t>Languages</w:t>
+      </w:r>
+      <w:r>
+        <w:t>}</w:t>
+      </w:r>
+      <w:r>
+        <w:t>}</w:t>
       </w:r>
     </w:p>
     <w:p>
@@ -1197,13 +1312,45 @@
           <w:rFonts w:ascii="Arial Black"/>
           <w:w w:val="90"/>
         </w:rPr>
-        <w:t>Developer Tools</w:t>
-      </w:r>
-      <w:r>
-        <w:rPr>
+        <w:t xml:space="preserve">Developer </w:t>
+      </w:r>
+      <w:proofErr w:type="gramStart"/>
+      <w:r>
+        <w:rPr>
+          <w:rFonts w:ascii="Arial Black"/>
           <w:w w:val="90"/>
         </w:rPr>
+        <w:t>Tools</w:t>
+      </w:r>
+      <w:r>
+        <w:rPr>
+          <w:w w:val="90"/>
+        </w:rPr>
         <w:t>:</w:t>
+      </w:r>
+      <w:r>
+        <w:rPr>
+          <w:w w:val="90"/>
+        </w:rPr>
+        <w:t xml:space="preserve"> </w:t>
+      </w:r>
+      <w:r>
+        <w:t>{</w:t>
+      </w:r>
+      <w:r>
+        <w:t>{</w:t>
+      </w:r>
+      <w:proofErr w:type="spellStart"/>
+      <w:proofErr w:type="gramEnd"/>
+      <w:r>
+        <w:t>DeveloperTools</w:t>
+      </w:r>
+      <w:proofErr w:type="spellEnd"/>
+      <w:r>
+        <w:t>}</w:t>
+      </w:r>
+      <w:r>
+        <w:t>}</w:t>
       </w:r>
     </w:p>
     <w:p>
@@ -1212,6 +1359,7 @@
         <w:spacing w:before="0" w:line="247" w:lineRule="exact"/>
         <w:ind w:left="215" w:firstLine="0"/>
       </w:pPr>
+      <w:proofErr w:type="gramStart"/>
       <w:r>
         <w:rPr>
           <w:rFonts w:ascii="Arial Black"/>
@@ -1224,6 +1372,28 @@
           <w:spacing w:val="-4"/>
         </w:rPr>
         <w:t>:</w:t>
+      </w:r>
+      <w:r>
+        <w:rPr>
+          <w:spacing w:val="-4"/>
+        </w:rPr>
+        <w:t xml:space="preserve"> </w:t>
+      </w:r>
+      <w:r>
+        <w:t>{</w:t>
+      </w:r>
+      <w:r>
+        <w:t>{</w:t>
+      </w:r>
+      <w:proofErr w:type="gramEnd"/>
+      <w:r>
+        <w:t>Concepts</w:t>
+      </w:r>
+      <w:r>
+        <w:t>}</w:t>
+      </w:r>
+      <w:r>
+        <w:t>}</w:t>
       </w:r>
     </w:p>
     <w:p>
@@ -1800,7 +1970,6 @@
   <w:style w:type="character" w:default="1" w:styleId="DefaultParagraphFont">
     <w:name w:val="Default Paragraph Font"/>
     <w:uiPriority w:val="1"/>
-    <w:semiHidden/>
     <w:unhideWhenUsed/>
   </w:style>
   <w:style w:type="table" w:default="1" w:styleId="TableNormal">

</xml_diff>